<commit_message>
Updated study notes and resources for all languages for 2026-06-02 release
</commit_message>
<xml_diff>
--- a/eng/docx/52.content.docx
+++ b/eng/docx/52.content.docx
@@ -1079,7 +1079,7 @@
         <w:rPr>
           <w:lang w:val="en_US" w:bidi="en_US"/>
         </w:rPr>
-        <w:t>Among the non-Jews (gentiles), the apostles encouraged people to turn from idols to serve the living and true God, who created everything (</w:t>
+        <w:t>Among the Gentiles (non-Jewish people), the apostles called people to turn away from false gods and worship the living and true God, who created all things (</w:t>
       </w:r>
       <w:hyperlink r:id="rId34">
         <w:r>
@@ -1133,7 +1133,7 @@
         <w:rPr>
           <w:lang w:val="en_US" w:bidi="en_US"/>
         </w:rPr>
-        <w:t xml:space="preserve">). In a society with many religions, asking people to abandon the gods of their ancestors was unusual (see </w:t>
+        <w:t xml:space="preserve">). In a society where many religions existed side by side, it was unusual to ask people to abandon the gods worshiped by their families and communities (see </w:t>
       </w:r>
       <w:hyperlink r:id="rId37">
         <w:r>
@@ -2772,7 +2772,7 @@
         <w:rPr>
           <w:lang w:val="en_US" w:bidi="en_US"/>
         </w:rPr>
-        <w:t>The mission to the non-Jews (gentiles) was a key issue in the early church (</w:t>
+        <w:t>The mission to the Gentiles was one of the most important issues in the early church (</w:t>
       </w:r>
       <w:hyperlink r:id="rId77">
         <w:r>
@@ -2862,7 +2862,7 @@
         <w:rPr>
           <w:lang w:val="en_US" w:bidi="en_US"/>
         </w:rPr>
-        <w:t>Wrath (or judgment) comes when sins increase to full capacity</w:t>
+        <w:t>Judgment comes when sins increase to full capacity</w:t>
       </w:r>
       <w:r>
         <w:rPr>
@@ -7101,7 +7101,7 @@
         <w:rPr>
           <w:lang w:val="en_US" w:bidi="en_US"/>
         </w:rPr>
-        <w:t>In talking about Jesus's return, Paul uses a Greek term (</w:t>
+        <w:t>In talking about the return of Jesus, Paul uses a Greek term (</w:t>
       </w:r>
       <w:r>
         <w:rPr>

</xml_diff>